<commit_message>
feat: habilitar visualizacion y edicion de tablas hijas en detalle de proceso de adopcion TSI
</commit_message>
<xml_diff>
--- a/00 - definicion de landscape tsi/03 mejoras funcionales.docx
+++ b/00 - definicion de landscape tsi/03 mejoras funcionales.docx
@@ -372,7 +372,7 @@
           </mc:Choice>
           <mc:Fallback>
             <w:pict>
-              <v:oval w14:anchorId="0E5C2ED5" id="Elipse 7" o:spid="_x0000_s1026" style="position:absolute;margin-left:198.3pt;margin-top:263pt;width:105.5pt;height:85.2pt;z-index:251659264;visibility:visible;mso-wrap-style:square;mso-wrap-distance-left:9pt;mso-wrap-distance-top:0;mso-wrap-distance-right:9pt;mso-wrap-distance-bottom:0;mso-position-horizontal:absolute;mso-position-horizontal-relative:text;mso-position-vertical:absolute;mso-position-vertical-relative:text;v-text-anchor:middle" o:gfxdata="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" filled="f" strokecolor="red" strokeweight="2.25pt">
+              <v:oval w14:anchorId="687DF113" id="Elipse 7" o:spid="_x0000_s1026" style="position:absolute;margin-left:198.3pt;margin-top:263pt;width:105.5pt;height:85.2pt;z-index:251659264;visibility:visible;mso-wrap-style:square;mso-wrap-distance-left:9pt;mso-wrap-distance-top:0;mso-wrap-distance-right:9pt;mso-wrap-distance-bottom:0;mso-position-horizontal:absolute;mso-position-horizontal-relative:text;mso-position-vertical:absolute;mso-position-vertical-relative:text;v-text-anchor:middle" o:gfxdata="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" filled="f" strokecolor="red" strokeweight="2.25pt">
                 <v:stroke joinstyle="miter"/>
               </v:oval>
             </w:pict>
@@ -420,27 +420,51 @@
     <w:p/>
     <w:p>
       <w:r>
-        <w:t xml:space="preserve">4.-Me doy cuenta que al momento de entrar a un proceso de evaluacion, por </w:t>
+        <w:t>4.-</w:t>
+      </w:r>
+      <w:r>
+        <w:rPr>
+          <w:strike/>
+        </w:rPr>
+        <w:t xml:space="preserve">Me doy cuenta que al momento de entrar a un proceso de evaluacion, por </w:t>
       </w:r>
       <w:proofErr w:type="gramStart"/>
       <w:r>
+        <w:rPr>
+          <w:strike/>
+        </w:rPr>
         <w:t>ejemplo</w:t>
       </w:r>
       <w:proofErr w:type="gramEnd"/>
       <w:r>
+        <w:rPr>
+          <w:strike/>
+        </w:rPr>
         <w:t xml:space="preserve"> en este caso el “WAAP”, no puedo editar los valores como la secciones de “Contratos y Adendas vinculados”, “Drivers de Costo y </w:t>
       </w:r>
       <w:proofErr w:type="spellStart"/>
       <w:r>
+        <w:rPr>
+          <w:strike/>
+        </w:rPr>
         <w:t>Proyeccion</w:t>
       </w:r>
       <w:proofErr w:type="spellEnd"/>
       <w:r>
+        <w:rPr>
+          <w:strike/>
+        </w:rPr>
         <w:t xml:space="preserve">”,  tampoco “Servicios y Tarifarios de TI </w:t>
       </w:r>
       <w:r>
+        <w:rPr>
+          <w:strike/>
+        </w:rPr>
         <w:lastRenderedPageBreak/>
-        <w:t>Vinculados”, debe de permitir editar los valores ingresados.</w:t>
+        <w:t>Vinculados”, debe de permitir editar los valores ingresados</w:t>
+      </w:r>
+      <w:r>
+        <w:t>.</w:t>
       </w:r>
       <w:r>
         <w:drawing>
@@ -483,22 +507,40 @@
     <w:p/>
     <w:p>
       <w:r>
-        <w:t>5.- Cuando a una empresa subsidiaria quiero registrar su información, veo el modal no da la alternativa para registrar una tecnología, en caso no se encuentre dentro de la lista del combo en el atributo “</w:t>
+        <w:t xml:space="preserve">5.- </w:t>
+      </w:r>
+      <w:r>
+        <w:rPr>
+          <w:strike/>
+        </w:rPr>
+        <w:t>Cuando a una empresa subsidiaria quiero registrar su información, veo el modal no da la alternativa para registrar una tecnología, en caso no se encuentre dentro de la lista del combo en el atributo “</w:t>
       </w:r>
       <w:proofErr w:type="spellStart"/>
       <w:r>
+        <w:rPr>
+          <w:strike/>
+        </w:rPr>
         <w:t>Tecnologia</w:t>
       </w:r>
       <w:proofErr w:type="spellEnd"/>
       <w:r>
+        <w:rPr>
+          <w:strike/>
+        </w:rPr>
         <w:t xml:space="preserve"> TSI *”, en todo caso el modal debe de tener la opción de registrar una “Tecnología TSI “ en caso el usuario no la encuentre y también la opción de realizar </w:t>
       </w:r>
       <w:proofErr w:type="spellStart"/>
       <w:r>
+        <w:rPr>
+          <w:strike/>
+        </w:rPr>
         <w:t>busqueda</w:t>
       </w:r>
       <w:proofErr w:type="spellEnd"/>
       <w:r>
+        <w:rPr>
+          <w:strike/>
+        </w:rPr>
         <w:t xml:space="preserve"> en caso existan muchos.</w:t>
       </w:r>
     </w:p>
@@ -743,6 +785,11 @@
     </w:p>
     <w:p/>
     <w:p>
+      <w:pPr>
+        <w:rPr>
+          <w:strike/>
+        </w:rPr>
+      </w:pPr>
       <w:r>
         <w:t xml:space="preserve">8. </w:t>
       </w:r>
@@ -870,6 +917,256 @@
         </w:drawing>
       </w:r>
     </w:p>
+    <w:p/>
+    <w:p>
+      <w:pPr>
+        <w:rPr>
+          <w:strike/>
+        </w:rPr>
+      </w:pPr>
+      <w:r>
+        <w:t>9.-</w:t>
+      </w:r>
+      <w:r>
+        <w:t xml:space="preserve"> </w:t>
+      </w:r>
+      <w:r>
+        <w:rPr>
+          <w:strike/>
+        </w:rPr>
+        <w:t>En el modulo “</w:t>
+      </w:r>
+      <w:proofErr w:type="spellStart"/>
+      <w:r>
+        <w:rPr>
+          <w:strike/>
+        </w:rPr>
+        <w:t>Documentacion</w:t>
+      </w:r>
+      <w:proofErr w:type="spellEnd"/>
+      <w:r>
+        <w:rPr>
+          <w:strike/>
+        </w:rPr>
+        <w:t xml:space="preserve">”, mueve la opción de “Vista de entidades”, y </w:t>
+      </w:r>
+      <w:proofErr w:type="spellStart"/>
+      <w:r>
+        <w:rPr>
+          <w:strike/>
+        </w:rPr>
+        <w:t>Reporteria</w:t>
+      </w:r>
+      <w:proofErr w:type="spellEnd"/>
+      <w:r>
+        <w:rPr>
+          <w:strike/>
+        </w:rPr>
+        <w:t xml:space="preserve"> también debería de ser un modulo al mismo nivel que </w:t>
+      </w:r>
+      <w:proofErr w:type="spellStart"/>
+      <w:r>
+        <w:rPr>
+          <w:strike/>
+        </w:rPr>
+        <w:t>Documentacion</w:t>
+      </w:r>
+      <w:proofErr w:type="spellEnd"/>
+      <w:r>
+        <w:rPr>
+          <w:strike/>
+        </w:rPr>
+        <w:t xml:space="preserve">, </w:t>
+      </w:r>
+      <w:proofErr w:type="spellStart"/>
+      <w:r>
+        <w:rPr>
+          <w:strike/>
+        </w:rPr>
+        <w:t>Administracion</w:t>
+      </w:r>
+      <w:proofErr w:type="spellEnd"/>
+      <w:r>
+        <w:rPr>
+          <w:strike/>
+        </w:rPr>
+        <w:t xml:space="preserve">, Auditoria. </w:t>
+      </w:r>
+    </w:p>
+    <w:p>
+      <w:r>
+        <w:drawing>
+          <wp:inline distT="0" distB="0" distL="0" distR="0" wp14:anchorId="19E31D06" wp14:editId="7325CD5C">
+            <wp:extent cx="5400040" cy="2259965"/>
+            <wp:effectExtent l="0" t="0" r="0" b="6985"/>
+            <wp:docPr id="15" name="Imagen 15"/>
+            <wp:cNvGraphicFramePr>
+              <a:graphicFrameLocks xmlns:a="http://schemas.openxmlformats.org/drawingml/2006/main" noChangeAspect="1"/>
+            </wp:cNvGraphicFramePr>
+            <a:graphic xmlns:a="http://schemas.openxmlformats.org/drawingml/2006/main">
+              <a:graphicData uri="http://schemas.openxmlformats.org/drawingml/2006/picture">
+                <pic:pic xmlns:pic="http://schemas.openxmlformats.org/drawingml/2006/picture">
+                  <pic:nvPicPr>
+                    <pic:cNvPr id="1" name=""/>
+                    <pic:cNvPicPr/>
+                  </pic:nvPicPr>
+                  <pic:blipFill>
+                    <a:blip r:embed="rId16"/>
+                    <a:stretch>
+                      <a:fillRect/>
+                    </a:stretch>
+                  </pic:blipFill>
+                  <pic:spPr>
+                    <a:xfrm>
+                      <a:off x="0" y="0"/>
+                      <a:ext cx="5400040" cy="2259965"/>
+                    </a:xfrm>
+                    <a:prstGeom prst="rect">
+                      <a:avLst/>
+                    </a:prstGeom>
+                  </pic:spPr>
+                </pic:pic>
+              </a:graphicData>
+            </a:graphic>
+          </wp:inline>
+        </w:drawing>
+      </w:r>
+    </w:p>
+    <w:p/>
+    <w:p>
+      <w:r>
+        <w:t xml:space="preserve">10.- </w:t>
+      </w:r>
+      <w:r>
+        <w:rPr>
+          <w:strike/>
+        </w:rPr>
+        <w:t>Veo que la opción para convocar empresas subsidiarias, no funciona adecuadamente, cuando entro al proceso de adopción en este caso de WAAP. Y me voy a la opción: “</w:t>
+      </w:r>
+      <w:r>
+        <w:rPr>
+          <w:strike/>
+        </w:rPr>
+        <w:t>2. Convocatoria a Empresas Subsidiarias y Adopción Real</w:t>
+      </w:r>
+      <w:r>
+        <w:rPr>
+          <w:strike/>
+        </w:rPr>
+        <w:t xml:space="preserve">” y presiono el botón “+ Convocar Subsidiaria”, cuando desmarco algunas empresas que YA NO QUIERO que participen, a pesar </w:t>
+      </w:r>
+      <w:r>
+        <w:rPr>
+          <w:strike/>
+        </w:rPr>
+        <w:lastRenderedPageBreak/>
+        <w:t>que las desmarco, y “Guardo Convocatoria”, veo que aun aparecen en el proceso de WAAP.</w:t>
+      </w:r>
+      <w:r>
+        <w:rPr>
+          <w:strike/>
+        </w:rPr>
+        <w:br/>
+      </w:r>
+      <w:proofErr w:type="spellStart"/>
+      <w:r>
+        <w:rPr>
+          <w:strike/>
+        </w:rPr>
+        <w:t>corrije</w:t>
+      </w:r>
+      <w:proofErr w:type="spellEnd"/>
+      <w:r>
+        <w:rPr>
+          <w:strike/>
+        </w:rPr>
+        <w:t xml:space="preserve"> el comportamiento, donde solo aparezcan las empresas que se seleccionan en Empresas subsidiarias.</w:t>
+      </w:r>
+    </w:p>
+    <w:p/>
+    <w:p/>
+    <w:p>
+      <w:r>
+        <w:drawing>
+          <wp:inline distT="0" distB="0" distL="0" distR="0" wp14:anchorId="3266A577" wp14:editId="3270BF7A">
+            <wp:extent cx="5400040" cy="4674870"/>
+            <wp:effectExtent l="0" t="0" r="0" b="0"/>
+            <wp:docPr id="16" name="Imagen 16"/>
+            <wp:cNvGraphicFramePr>
+              <a:graphicFrameLocks xmlns:a="http://schemas.openxmlformats.org/drawingml/2006/main" noChangeAspect="1"/>
+            </wp:cNvGraphicFramePr>
+            <a:graphic xmlns:a="http://schemas.openxmlformats.org/drawingml/2006/main">
+              <a:graphicData uri="http://schemas.openxmlformats.org/drawingml/2006/picture">
+                <pic:pic xmlns:pic="http://schemas.openxmlformats.org/drawingml/2006/picture">
+                  <pic:nvPicPr>
+                    <pic:cNvPr id="1" name=""/>
+                    <pic:cNvPicPr/>
+                  </pic:nvPicPr>
+                  <pic:blipFill>
+                    <a:blip r:embed="rId17"/>
+                    <a:stretch>
+                      <a:fillRect/>
+                    </a:stretch>
+                  </pic:blipFill>
+                  <pic:spPr>
+                    <a:xfrm>
+                      <a:off x="0" y="0"/>
+                      <a:ext cx="5400040" cy="4674870"/>
+                    </a:xfrm>
+                    <a:prstGeom prst="rect">
+                      <a:avLst/>
+                    </a:prstGeom>
+                  </pic:spPr>
+                </pic:pic>
+              </a:graphicData>
+            </a:graphic>
+          </wp:inline>
+        </w:drawing>
+      </w:r>
+    </w:p>
+    <w:p/>
+    <w:p>
+      <w:r>
+        <w:lastRenderedPageBreak/>
+        <w:drawing>
+          <wp:inline distT="0" distB="0" distL="0" distR="0" wp14:anchorId="548BB482" wp14:editId="2646DE8A">
+            <wp:extent cx="5400040" cy="2885440"/>
+            <wp:effectExtent l="0" t="0" r="0" b="0"/>
+            <wp:docPr id="17" name="Imagen 17"/>
+            <wp:cNvGraphicFramePr>
+              <a:graphicFrameLocks xmlns:a="http://schemas.openxmlformats.org/drawingml/2006/main" noChangeAspect="1"/>
+            </wp:cNvGraphicFramePr>
+            <a:graphic xmlns:a="http://schemas.openxmlformats.org/drawingml/2006/main">
+              <a:graphicData uri="http://schemas.openxmlformats.org/drawingml/2006/picture">
+                <pic:pic xmlns:pic="http://schemas.openxmlformats.org/drawingml/2006/picture">
+                  <pic:nvPicPr>
+                    <pic:cNvPr id="1" name=""/>
+                    <pic:cNvPicPr/>
+                  </pic:nvPicPr>
+                  <pic:blipFill>
+                    <a:blip r:embed="rId18"/>
+                    <a:stretch>
+                      <a:fillRect/>
+                    </a:stretch>
+                  </pic:blipFill>
+                  <pic:spPr>
+                    <a:xfrm>
+                      <a:off x="0" y="0"/>
+                      <a:ext cx="5400040" cy="2885440"/>
+                    </a:xfrm>
+                    <a:prstGeom prst="rect">
+                      <a:avLst/>
+                    </a:prstGeom>
+                  </pic:spPr>
+                </pic:pic>
+              </a:graphicData>
+            </a:graphic>
+          </wp:inline>
+        </w:drawing>
+      </w:r>
+    </w:p>
+    <w:p/>
+    <w:p/>
     <w:sectPr>
       <w:pgSz w:w="11906" w:h="16838"/>
       <w:pgMar w:top="1417" w:right="1701" w:bottom="1417" w:left="1701" w:header="708" w:footer="708" w:gutter="0"/>
@@ -1279,6 +1576,26 @@
     <w:name w:val="Normal"/>
     <w:qFormat/>
   </w:style>
+  <w:style w:type="paragraph" w:styleId="Ttulo2">
+    <w:name w:val="heading 2"/>
+    <w:basedOn w:val="Normal"/>
+    <w:link w:val="Ttulo2Car"/>
+    <w:uiPriority w:val="9"/>
+    <w:qFormat/>
+    <w:rsid w:val="00B620E4"/>
+    <w:pPr>
+      <w:spacing w:before="100" w:beforeAutospacing="1" w:after="100" w:afterAutospacing="1" w:line="240" w:lineRule="auto"/>
+      <w:outlineLvl w:val="1"/>
+    </w:pPr>
+    <w:rPr>
+      <w:rFonts w:ascii="Times New Roman" w:eastAsia="Times New Roman" w:hAnsi="Times New Roman" w:cs="Times New Roman"/>
+      <w:b/>
+      <w:bCs/>
+      <w:sz w:val="36"/>
+      <w:szCs w:val="36"/>
+      <w:lang w:eastAsia="es-PE"/>
+    </w:rPr>
+  </w:style>
   <w:style w:type="character" w:default="1" w:styleId="Fuentedeprrafopredeter">
     <w:name w:val="Default Paragraph Font"/>
     <w:uiPriority w:val="1"/>
@@ -1305,6 +1622,21 @@
     <w:uiPriority w:val="99"/>
     <w:semiHidden/>
     <w:unhideWhenUsed/>
+  </w:style>
+  <w:style w:type="character" w:customStyle="1" w:styleId="Ttulo2Car">
+    <w:name w:val="Título 2 Car"/>
+    <w:basedOn w:val="Fuentedeprrafopredeter"/>
+    <w:link w:val="Ttulo2"/>
+    <w:uiPriority w:val="9"/>
+    <w:rsid w:val="00B620E4"/>
+    <w:rPr>
+      <w:rFonts w:ascii="Times New Roman" w:eastAsia="Times New Roman" w:hAnsi="Times New Roman" w:cs="Times New Roman"/>
+      <w:b/>
+      <w:bCs/>
+      <w:sz w:val="36"/>
+      <w:szCs w:val="36"/>
+      <w:lang w:eastAsia="es-PE"/>
+    </w:rPr>
   </w:style>
 </w:styles>
 </file>

</xml_diff>